<commit_message>
Fix Feat : Cleaned Roles and Readme/ Added simple Bitmasking and Map Gen
</commit_message>
<xml_diff>
--- a/collageRequirement/PBL_Project_Proposal.docx
+++ b/collageRequirement/PBL_Project_Proposal.docx
@@ -230,33 +230,47 @@
                 <w:noProof/>
               </w:rPr>
               <w:drawing>
-                <wp:inline distT="0" distB="0" distL="0" distR="0" wp14:anchorId="490CAD10" wp14:editId="06580A92">
-                  <wp:extent cx="1503045" cy="990600"/>
-                  <wp:effectExtent l="0" t="0" r="5715" b="0"/>
-                  <wp:docPr id="5" name="image1.jpg" descr="Here's why Kit Harington is still rocking his John Snow look"/>
-                  <wp:cNvGraphicFramePr/>
+                <wp:inline distT="0" distB="0" distL="0" distR="0" wp14:anchorId="2331485A" wp14:editId="2BCF94CC">
+                  <wp:extent cx="1113692" cy="1084670"/>
+                  <wp:effectExtent l="0" t="0" r="0" b="1270"/>
+                  <wp:docPr id="1047369474" name="Picture 1"/>
+                  <wp:cNvGraphicFramePr>
+                    <a:graphicFrameLocks xmlns:a="http://schemas.openxmlformats.org/drawingml/2006/main" noChangeAspect="1"/>
+                  </wp:cNvGraphicFramePr>
                   <a:graphic xmlns:a="http://schemas.openxmlformats.org/drawingml/2006/main">
                     <a:graphicData uri="http://schemas.openxmlformats.org/drawingml/2006/picture">
                       <pic:pic xmlns:pic="http://schemas.openxmlformats.org/drawingml/2006/picture">
                         <pic:nvPicPr>
-                          <pic:cNvPr id="5" name="image1.jpg" descr="Here's why Kit Harington is still rocking his John Snow look"/>
-                          <pic:cNvPicPr preferRelativeResize="0"/>
+                          <pic:cNvPr id="0" name="Picture 1"/>
+                          <pic:cNvPicPr>
+                            <a:picLocks noChangeAspect="1" noChangeArrowheads="1"/>
+                          </pic:cNvPicPr>
                         </pic:nvPicPr>
                         <pic:blipFill>
-                          <a:blip r:embed="rId8"/>
+                          <a:blip r:embed="rId8" cstate="print">
+                            <a:extLst>
+                              <a:ext uri="{28A0092B-C50C-407E-A947-70E740481C1C}">
+                                <a14:useLocalDpi xmlns:a14="http://schemas.microsoft.com/office/drawing/2010/main" val="0"/>
+                              </a:ext>
+                            </a:extLst>
+                          </a:blip>
                           <a:srcRect/>
                           <a:stretch>
                             <a:fillRect/>
                           </a:stretch>
                         </pic:blipFill>
-                        <pic:spPr>
+                        <pic:spPr bwMode="auto">
                           <a:xfrm>
                             <a:off x="0" y="0"/>
-                            <a:ext cx="1503045" cy="990600"/>
+                            <a:ext cx="1120367" cy="1091171"/>
                           </a:xfrm>
                           <a:prstGeom prst="rect">
                             <a:avLst/>
                           </a:prstGeom>
+                          <a:noFill/>
+                          <a:ln>
+                            <a:noFill/>
+                          </a:ln>
                         </pic:spPr>
                       </pic:pic>
                     </a:graphicData>
@@ -338,33 +352,52 @@
                 <w:noProof/>
               </w:rPr>
               <w:drawing>
-                <wp:inline distT="0" distB="0" distL="0" distR="0" wp14:anchorId="7A9A28A6" wp14:editId="07166F8E">
-                  <wp:extent cx="1563370" cy="1059180"/>
-                  <wp:effectExtent l="0" t="0" r="6350" b="7620"/>
-                  <wp:docPr id="2" name="image1.jpg" descr="Here's why Kit Harington is still rocking his John Snow look"/>
-                  <wp:cNvGraphicFramePr/>
+                <wp:inline distT="0" distB="0" distL="0" distR="0" wp14:anchorId="7669323E" wp14:editId="66BAEAD3">
+                  <wp:extent cx="1037492" cy="1038504"/>
+                  <wp:effectExtent l="0" t="0" r="0" b="0"/>
+                  <wp:docPr id="1761475990" name="Picture 2"/>
+                  <wp:cNvGraphicFramePr>
+                    <a:graphicFrameLocks xmlns:a="http://schemas.openxmlformats.org/drawingml/2006/main" noChangeAspect="1"/>
+                  </wp:cNvGraphicFramePr>
                   <a:graphic xmlns:a="http://schemas.openxmlformats.org/drawingml/2006/main">
                     <a:graphicData uri="http://schemas.openxmlformats.org/drawingml/2006/picture">
                       <pic:pic xmlns:pic="http://schemas.openxmlformats.org/drawingml/2006/picture">
                         <pic:nvPicPr>
-                          <pic:cNvPr id="2" name="image1.jpg" descr="Here's why Kit Harington is still rocking his John Snow look"/>
-                          <pic:cNvPicPr preferRelativeResize="0"/>
+                          <pic:cNvPr id="0" name="Picture 2"/>
+                          <pic:cNvPicPr>
+                            <a:picLocks noChangeAspect="1" noChangeArrowheads="1"/>
+                          </pic:cNvPicPr>
                         </pic:nvPicPr>
-                        <pic:blipFill>
-                          <a:blip r:embed="rId8"/>
-                          <a:srcRect/>
+                        <pic:blipFill rotWithShape="1">
+                          <a:blip r:embed="rId9" cstate="print">
+                            <a:extLst>
+                              <a:ext uri="{28A0092B-C50C-407E-A947-70E740481C1C}">
+                                <a14:useLocalDpi xmlns:a14="http://schemas.microsoft.com/office/drawing/2010/main" val="0"/>
+                              </a:ext>
+                            </a:extLst>
+                          </a:blip>
+                          <a:srcRect t="11140" b="11345"/>
                           <a:stretch>
                             <a:fillRect/>
                           </a:stretch>
                         </pic:blipFill>
-                        <pic:spPr>
+                        <pic:spPr bwMode="auto">
                           <a:xfrm>
                             <a:off x="0" y="0"/>
-                            <a:ext cx="1563370" cy="1059180"/>
+                            <a:ext cx="1056733" cy="1057764"/>
                           </a:xfrm>
                           <a:prstGeom prst="rect">
                             <a:avLst/>
                           </a:prstGeom>
+                          <a:noFill/>
+                          <a:ln>
+                            <a:noFill/>
+                          </a:ln>
+                          <a:extLst>
+                            <a:ext uri="{53640926-AAD7-44D8-BBD7-CCE9431645EC}">
+                              <a14:shadowObscured xmlns:a14="http://schemas.microsoft.com/office/drawing/2010/main"/>
+                            </a:ext>
+                          </a:extLst>
                         </pic:spPr>
                       </pic:pic>
                     </a:graphicData>
@@ -372,6 +405,24 @@
                 </wp:inline>
               </w:drawing>
             </w:r>
+          </w:p>
+        </w:tc>
+        <w:tc>
+          <w:tcPr>
+            <w:gridSpan w:val="0"/>
+          </w:tcPr>
+          <w:p>
+            <w:pPr>
+              <w:spacing w:line="240" w:lineRule="auto"/>
+            </w:pPr>
+            <w:hyperlink r:id="rId10" w:history="1">
+              <w:r>
+                <w:rPr>
+                  <w:rStyle w:val="Hyperlink"/>
+                </w:rPr>
+                <w:t>blob:https://web.whatsapp.com/5403c19f-c118-4109-a37b-f589198025a9</w:t>
+              </w:r>
+            </w:hyperlink>
           </w:p>
         </w:tc>
       </w:tr>
@@ -456,33 +507,47 @@
                 <w:noProof/>
               </w:rPr>
               <w:drawing>
-                <wp:inline distT="0" distB="0" distL="0" distR="0" wp14:anchorId="02C248D2" wp14:editId="72705689">
-                  <wp:extent cx="1577975" cy="953135"/>
-                  <wp:effectExtent l="0" t="0" r="6985" b="6985"/>
-                  <wp:docPr id="3" name="image1.jpg" descr="Here's why Kit Harington is still rocking his John Snow look"/>
-                  <wp:cNvGraphicFramePr/>
+                <wp:inline distT="0" distB="0" distL="0" distR="0" wp14:anchorId="033DC03E" wp14:editId="0318BA97">
+                  <wp:extent cx="1025769" cy="1025769"/>
+                  <wp:effectExtent l="0" t="0" r="3175" b="3175"/>
+                  <wp:docPr id="871658925" name="Picture 3"/>
+                  <wp:cNvGraphicFramePr>
+                    <a:graphicFrameLocks xmlns:a="http://schemas.openxmlformats.org/drawingml/2006/main" noChangeAspect="1"/>
+                  </wp:cNvGraphicFramePr>
                   <a:graphic xmlns:a="http://schemas.openxmlformats.org/drawingml/2006/main">
                     <a:graphicData uri="http://schemas.openxmlformats.org/drawingml/2006/picture">
                       <pic:pic xmlns:pic="http://schemas.openxmlformats.org/drawingml/2006/picture">
                         <pic:nvPicPr>
-                          <pic:cNvPr id="3" name="image1.jpg" descr="Here's why Kit Harington is still rocking his John Snow look"/>
-                          <pic:cNvPicPr preferRelativeResize="0"/>
+                          <pic:cNvPr id="0" name="Picture 3"/>
+                          <pic:cNvPicPr>
+                            <a:picLocks noChangeAspect="1" noChangeArrowheads="1"/>
+                          </pic:cNvPicPr>
                         </pic:nvPicPr>
                         <pic:blipFill>
-                          <a:blip r:embed="rId8"/>
+                          <a:blip r:embed="rId11" cstate="print">
+                            <a:extLst>
+                              <a:ext uri="{28A0092B-C50C-407E-A947-70E740481C1C}">
+                                <a14:useLocalDpi xmlns:a14="http://schemas.microsoft.com/office/drawing/2010/main" val="0"/>
+                              </a:ext>
+                            </a:extLst>
+                          </a:blip>
                           <a:srcRect/>
                           <a:stretch>
                             <a:fillRect/>
                           </a:stretch>
                         </pic:blipFill>
-                        <pic:spPr>
+                        <pic:spPr bwMode="auto">
                           <a:xfrm>
                             <a:off x="0" y="0"/>
-                            <a:ext cx="1577975" cy="953135"/>
+                            <a:ext cx="1029783" cy="1029783"/>
                           </a:xfrm>
                           <a:prstGeom prst="rect">
                             <a:avLst/>
                           </a:prstGeom>
+                          <a:noFill/>
+                          <a:ln>
+                            <a:noFill/>
+                          </a:ln>
                         </pic:spPr>
                       </pic:pic>
                     </a:graphicData>
@@ -568,33 +633,47 @@
                 <w:noProof/>
               </w:rPr>
               <w:drawing>
-                <wp:inline distT="0" distB="0" distL="0" distR="0" wp14:anchorId="5AB4B317" wp14:editId="61476AB8">
-                  <wp:extent cx="1548765" cy="899160"/>
-                  <wp:effectExtent l="0" t="0" r="5715" b="0"/>
-                  <wp:docPr id="4" name="image1.jpg" descr="Here's why Kit Harington is still rocking his John Snow look"/>
-                  <wp:cNvGraphicFramePr/>
+                <wp:inline distT="0" distB="0" distL="0" distR="0" wp14:anchorId="0B5C33E8" wp14:editId="7FF2078D">
+                  <wp:extent cx="1219200" cy="913437"/>
+                  <wp:effectExtent l="0" t="0" r="0" b="1270"/>
+                  <wp:docPr id="1636024855" name="Picture 4"/>
+                  <wp:cNvGraphicFramePr>
+                    <a:graphicFrameLocks xmlns:a="http://schemas.openxmlformats.org/drawingml/2006/main" noChangeAspect="1"/>
+                  </wp:cNvGraphicFramePr>
                   <a:graphic xmlns:a="http://schemas.openxmlformats.org/drawingml/2006/main">
                     <a:graphicData uri="http://schemas.openxmlformats.org/drawingml/2006/picture">
                       <pic:pic xmlns:pic="http://schemas.openxmlformats.org/drawingml/2006/picture">
                         <pic:nvPicPr>
-                          <pic:cNvPr id="4" name="image1.jpg" descr="Here's why Kit Harington is still rocking his John Snow look"/>
-                          <pic:cNvPicPr preferRelativeResize="0"/>
+                          <pic:cNvPr id="0" name="Picture 4"/>
+                          <pic:cNvPicPr>
+                            <a:picLocks noChangeAspect="1" noChangeArrowheads="1"/>
+                          </pic:cNvPicPr>
                         </pic:nvPicPr>
                         <pic:blipFill>
-                          <a:blip r:embed="rId8"/>
+                          <a:blip r:embed="rId12" cstate="print">
+                            <a:extLst>
+                              <a:ext uri="{28A0092B-C50C-407E-A947-70E740481C1C}">
+                                <a14:useLocalDpi xmlns:a14="http://schemas.microsoft.com/office/drawing/2010/main" val="0"/>
+                              </a:ext>
+                            </a:extLst>
+                          </a:blip>
                           <a:srcRect/>
                           <a:stretch>
                             <a:fillRect/>
                           </a:stretch>
                         </pic:blipFill>
-                        <pic:spPr>
+                        <pic:spPr bwMode="auto">
                           <a:xfrm>
                             <a:off x="0" y="0"/>
-                            <a:ext cx="1548765" cy="899160"/>
+                            <a:ext cx="1231842" cy="922908"/>
                           </a:xfrm>
                           <a:prstGeom prst="rect">
                             <a:avLst/>
                           </a:prstGeom>
+                          <a:noFill/>
+                          <a:ln>
+                            <a:noFill/>
+                          </a:ln>
                         </pic:spPr>
                       </pic:pic>
                     </a:graphicData>
@@ -784,6 +863,61 @@
                 <w:noProof/>
               </w:rPr>
             </w:pPr>
+            <w:r>
+              <w:rPr>
+                <w:noProof/>
+              </w:rPr>
+              <w:drawing>
+                <wp:inline distT="0" distB="0" distL="0" distR="0" wp14:anchorId="6CB74A9D" wp14:editId="59753152">
+                  <wp:extent cx="927630" cy="1160438"/>
+                  <wp:effectExtent l="0" t="0" r="6350" b="1905"/>
+                  <wp:docPr id="1736365591" name="Picture 5"/>
+                  <wp:cNvGraphicFramePr>
+                    <a:graphicFrameLocks xmlns:a="http://schemas.openxmlformats.org/drawingml/2006/main" noChangeAspect="1"/>
+                  </wp:cNvGraphicFramePr>
+                  <a:graphic xmlns:a="http://schemas.openxmlformats.org/drawingml/2006/main">
+                    <a:graphicData uri="http://schemas.openxmlformats.org/drawingml/2006/picture">
+                      <pic:pic xmlns:pic="http://schemas.openxmlformats.org/drawingml/2006/picture">
+                        <pic:nvPicPr>
+                          <pic:cNvPr id="1736365591" name="Picture 1736365591"/>
+                          <pic:cNvPicPr/>
+                        </pic:nvPicPr>
+                        <pic:blipFill rotWithShape="1">
+                          <a:blip r:embed="rId13" cstate="print">
+                            <a:extLst>
+                              <a:ext uri="{28A0092B-C50C-407E-A947-70E740481C1C}">
+                                <a14:useLocalDpi xmlns:a14="http://schemas.microsoft.com/office/drawing/2010/main" val="0"/>
+                              </a:ext>
+                            </a:extLst>
+                          </a:blip>
+                          <a:srcRect t="8527" b="21137"/>
+                          <a:stretch>
+                            <a:fillRect/>
+                          </a:stretch>
+                        </pic:blipFill>
+                        <pic:spPr bwMode="auto">
+                          <a:xfrm>
+                            <a:off x="0" y="0"/>
+                            <a:ext cx="940332" cy="1176328"/>
+                          </a:xfrm>
+                          <a:prstGeom prst="rect">
+                            <a:avLst/>
+                          </a:prstGeom>
+                          <a:ln>
+                            <a:noFill/>
+                          </a:ln>
+                          <a:extLst>
+                            <a:ext uri="{53640926-AAD7-44D8-BBD7-CCE9431645EC}">
+                              <a14:shadowObscured xmlns:a14="http://schemas.microsoft.com/office/drawing/2010/main"/>
+                            </a:ext>
+                          </a:extLst>
+                        </pic:spPr>
+                      </pic:pic>
+                    </a:graphicData>
+                  </a:graphic>
+                </wp:inline>
+              </w:drawing>
+            </w:r>
           </w:p>
         </w:tc>
       </w:tr>
@@ -2811,8 +2945,8 @@
     </w:tbl>
     <w:p/>
     <w:sectPr>
-      <w:headerReference w:type="default" r:id="rId9"/>
-      <w:footerReference w:type="default" r:id="rId10"/>
+      <w:headerReference w:type="default" r:id="rId14"/>
+      <w:footerReference w:type="default" r:id="rId15"/>
       <w:pgSz w:w="12240" w:h="15840"/>
       <w:pgMar w:top="720" w:right="1152" w:bottom="1008" w:left="1008" w:header="720" w:footer="720" w:gutter="0"/>
       <w:pgNumType w:start="1"/>
@@ -4629,6 +4763,27 @@
       <w:contextualSpacing/>
     </w:pPr>
   </w:style>
+  <w:style w:type="character" w:styleId="Hyperlink">
+    <w:name w:val="Hyperlink"/>
+    <w:basedOn w:val="DefaultParagraphFont"/>
+    <w:rsid w:val="00272005"/>
+    <w:rPr>
+      <w:color w:val="0000FF" w:themeColor="hyperlink"/>
+      <w:u w:val="single"/>
+    </w:rPr>
+  </w:style>
+  <w:style w:type="character" w:styleId="UnresolvedMention">
+    <w:name w:val="Unresolved Mention"/>
+    <w:basedOn w:val="DefaultParagraphFont"/>
+    <w:uiPriority w:val="99"/>
+    <w:semiHidden/>
+    <w:unhideWhenUsed/>
+    <w:rsid w:val="00272005"/>
+    <w:rPr>
+      <w:color w:val="605E5C"/>
+      <w:shd w:val="clear" w:color="auto" w:fill="E1DFDD"/>
+    </w:rPr>
+  </w:style>
 </w:styles>
 </file>
 

</xml_diff>